<commit_message>
Sync updated files to GitHub and remove executables
</commit_message>
<xml_diff>
--- a/templates/刑事辩护/4授权委托书-刑事案件专用.docx
+++ b/templates/刑事辩护/4授权委托书-刑事案件专用.docx
@@ -59,16 +59,25 @@
           <w:szCs w:val="30"/>
           <w:u w:val="single"/>
         </w:rPr>
-        <w:t xml:space="preserve">{{委托人}}（系{{犯罪嫌疑人或被告人}} </w:t>
-      </w:r>
-      <w:r>
-        <w:rPr>
-          <w:rFonts w:ascii="SimSun" w:hAnsi="SimSun" w:eastAsia="SimSun"/>
-          <w:sz w:val="30"/>
-          <w:szCs w:val="30"/>
-          <w:u w:val="single"/>
-        </w:rPr>
-        <w:t xml:space="preserve">  </w:t>
+        <w:t xml:space="preserve"> </w:t>
+      </w:r>
+      <w:r>
+        <w:rPr>
+          <w:rFonts w:hint="default" w:ascii="SimSun" w:hAnsi="SimSun" w:eastAsia="SimSun"/>
+          <w:sz w:val="30"/>
+          <w:szCs w:val="30"/>
+          <w:u w:val="single"/>
+        </w:rPr>
+        <w:t>{{二委托人}}</w:t>
+      </w:r>
+      <w:r>
+        <w:rPr>
+          <w:rFonts w:ascii="SimSun" w:hAnsi="SimSun" w:eastAsia="SimSun"/>
+          <w:sz w:val="30"/>
+          <w:szCs w:val="30"/>
+          <w:u w:val="single"/>
+        </w:rPr>
+        <w:t xml:space="preserve"> </w:t>
       </w:r>
       <w:r>
         <w:rPr>
@@ -77,79 +86,7 @@
           <w:szCs w:val="30"/>
           <w:u w:val="single"/>
         </w:rPr>
-        <w:t xml:space="preserve"> </w:t>
-      </w:r>
-      <w:r>
-        <w:rPr>
-          <w:rFonts w:ascii="SimSun" w:hAnsi="SimSun" w:eastAsia="SimSun"/>
-          <w:sz w:val="30"/>
-          <w:szCs w:val="30"/>
-          <w:u w:val="single"/>
-        </w:rPr>
-        <w:t xml:space="preserve"> </w:t>
-      </w:r>
-      <w:r>
-        <w:rPr>
-          <w:rFonts w:hint="eastAsia" w:ascii="SimSun" w:hAnsi="SimSun" w:eastAsia="SimSun"/>
-          <w:sz w:val="30"/>
-          <w:szCs w:val="30"/>
-          <w:u w:val="single"/>
-        </w:rPr>
-        <w:t>）</w:t>
-      </w:r>
-      <w:r>
-        <w:rPr>
-          <w:rFonts w:hint="eastAsia" w:ascii="SimSun" w:hAnsi="SimSun" w:eastAsia="SimSun"/>
-          <w:sz w:val="30"/>
-          <w:szCs w:val="30"/>
-          <w:u w:val="single"/>
-          <w:lang w:val="en-US" w:eastAsia="zh-CN"/>
-        </w:rPr>
-        <w:t xml:space="preserve"> </w:t>
-      </w:r>
-      <w:r>
-        <w:rPr>
-          <w:rFonts w:ascii="SimSun" w:hAnsi="SimSun" w:eastAsia="SimSun"/>
-          <w:sz w:val="30"/>
-          <w:szCs w:val="30"/>
-          <w:u w:val="single"/>
-        </w:rPr>
-        <w:t xml:space="preserve"> </w:t>
-      </w:r>
-      <w:r>
-        <w:rPr>
-          <w:rFonts w:hint="eastAsia" w:ascii="SimSun" w:hAnsi="SimSun" w:eastAsia="SimSun"/>
-          <w:sz w:val="30"/>
-          <w:szCs w:val="30"/>
-          <w:u w:val="single"/>
-        </w:rPr>
-        <w:t xml:space="preserve"> </w:t>
-      </w:r>
-      <w:r>
-        <w:rPr>
-          <w:rFonts w:ascii="Times New Roman" w:hAnsi="Times New Roman" w:eastAsia="SimSun" w:cs="Times New Roman"/>
-          <w:sz w:val="30"/>
-          <w:szCs w:val="30"/>
-          <w:u w:val="single"/>
-        </w:rPr>
-        <w:t xml:space="preserve"> </w:t>
-      </w:r>
-      <w:r>
-        <w:rPr>
-          <w:rFonts w:ascii="SimSun" w:hAnsi="SimSun" w:eastAsia="SimSun"/>
-          <w:sz w:val="30"/>
-          <w:szCs w:val="30"/>
-        </w:rPr>
-        <w:t>根据《中华人民共和国刑事诉讼法》相关规定，特聘请北京市盈科（青岛）律师事务所律师</w:t>
-      </w:r>
-      <w:r>
-        <w:rPr>
-          <w:rFonts w:hint="eastAsia" w:ascii="SimSun" w:hAnsi="SimSun" w:eastAsia="SimSun"/>
-          <w:sz w:val="30"/>
-          <w:szCs w:val="30"/>
-          <w:u w:val="single"/>
-        </w:rPr>
-        <w:t xml:space="preserve"> </w:t>
+        <w:t>（系</w:t>
       </w:r>
       <w:r>
         <w:rPr>
@@ -158,112 +95,230 @@
           <w:szCs w:val="30"/>
           <w:u w:val="single"/>
         </w:rPr>
-        <w:t>{{承办律师}}</w:t>
-      </w:r>
-      <w:r>
-        <w:rPr>
-          <w:rFonts w:ascii="SimSun" w:hAnsi="SimSun" w:eastAsia="SimSun"/>
-          <w:sz w:val="30"/>
-          <w:szCs w:val="30"/>
-          <w:u w:val="single"/>
-        </w:rPr>
-        <w:t xml:space="preserve"> </w:t>
-      </w:r>
-      <w:r>
-        <w:rPr>
-          <w:rFonts w:ascii="SimSun" w:hAnsi="SimSun" w:eastAsia="SimSun"/>
-          <w:sz w:val="30"/>
-          <w:szCs w:val="30"/>
-        </w:rPr>
-        <w:t>为</w:t>
-      </w:r>
-      <w:r>
-        <w:rPr>
-          <w:rFonts w:hint="eastAsia" w:ascii="SimSun" w:hAnsi="SimSun" w:eastAsia="SimSun"/>
-          <w:sz w:val="30"/>
-          <w:szCs w:val="30"/>
-        </w:rPr>
-        <w:t>涉嫌</w:t>
-      </w:r>
-      <w:r>
-        <w:rPr>
-          <w:rFonts w:hint="eastAsia" w:ascii="SimSun" w:hAnsi="SimSun" w:eastAsia="SimSun"/>
-          <w:sz w:val="30"/>
-          <w:szCs w:val="30"/>
-          <w:u w:val="single"/>
-        </w:rPr>
-        <w:t xml:space="preserve"> </w:t>
-      </w:r>
-      <w:r>
-        <w:rPr>
-          <w:rFonts w:hint="default" w:ascii="SimSun" w:hAnsi="SimSun" w:eastAsia="SimSun"/>
-          <w:sz w:val="30"/>
-          <w:szCs w:val="30"/>
-          <w:u w:val="single"/>
-        </w:rPr>
-        <w:t>{{案由}}</w:t>
-      </w:r>
-      <w:r>
-        <w:rPr>
-          <w:rFonts w:ascii="SimSun" w:hAnsi="SimSun" w:eastAsia="SimSun"/>
-          <w:sz w:val="30"/>
-          <w:szCs w:val="30"/>
-          <w:u w:val="single"/>
-        </w:rPr>
-        <w:t xml:space="preserve"> </w:t>
-      </w:r>
-      <w:r>
-        <w:rPr>
-          <w:rFonts w:ascii="SimSun" w:hAnsi="SimSun" w:eastAsia="SimSun"/>
-          <w:sz w:val="30"/>
-          <w:szCs w:val="30"/>
-        </w:rPr>
-        <w:t>案件的犯罪嫌疑人</w:t>
-      </w:r>
-      <w:r>
-        <w:rPr>
-          <w:rFonts w:hint="eastAsia" w:ascii="SimSun" w:hAnsi="SimSun" w:eastAsia="SimSun"/>
-          <w:sz w:val="30"/>
-          <w:szCs w:val="30"/>
-        </w:rPr>
-        <w:t>/</w:t>
-      </w:r>
-      <w:r>
-        <w:rPr>
-          <w:rFonts w:ascii="SimSun" w:hAnsi="SimSun" w:eastAsia="SimSun"/>
-          <w:sz w:val="30"/>
-          <w:szCs w:val="30"/>
-        </w:rPr>
-        <w:t>被告人</w:t>
-      </w:r>
-      <w:r>
-        <w:rPr>
-          <w:rFonts w:hint="eastAsia" w:ascii="SimSun" w:hAnsi="SimSun" w:eastAsia="SimSun"/>
-          <w:sz w:val="30"/>
-          <w:szCs w:val="30"/>
-          <w:u w:val="single"/>
-        </w:rPr>
-        <w:t xml:space="preserve"> {{犯罪嫌疑人或被告人}}</w:t>
-      </w:r>
-      <w:r>
-        <w:rPr>
-          <w:rFonts w:ascii="Times New Roman" w:hAnsi="Times New Roman" w:eastAsia="SimSun" w:cs="Times New Roman"/>
-          <w:sz w:val="30"/>
-          <w:szCs w:val="30"/>
-          <w:u w:val="single"/>
-        </w:rPr>
-        <w:t xml:space="preserve"> </w:t>
-      </w:r>
-      <w:r>
-        <w:rPr>
-          <w:rFonts w:ascii="SimSun" w:hAnsi="SimSun" w:eastAsia="SimSun"/>
-          <w:sz w:val="30"/>
-          <w:szCs w:val="30"/>
-        </w:rPr>
-        <w:t>的辩护人。</w:t>
+        <w:t>{{八犯罪嫌疑人}}</w:t>
       </w:r>
       <w:bookmarkStart w:id="0" w:name="_GoBack"/>
       <w:bookmarkEnd w:id="0"/>
+      <w:r>
+        <w:rPr>
+          <w:rFonts w:hint="eastAsia" w:ascii="SimSun" w:hAnsi="SimSun" w:eastAsia="SimSun"/>
+          <w:sz w:val="30"/>
+          <w:szCs w:val="30"/>
+          <w:u w:val="single"/>
+          <w:lang w:val="en-US" w:eastAsia="zh-CN"/>
+        </w:rPr>
+        <w:t xml:space="preserve"> </w:t>
+      </w:r>
+      <w:r>
+        <w:rPr>
+          <w:rFonts w:ascii="SimSun" w:hAnsi="SimSun" w:eastAsia="SimSun"/>
+          <w:sz w:val="30"/>
+          <w:szCs w:val="30"/>
+          <w:u w:val="single"/>
+        </w:rPr>
+        <w:t xml:space="preserve"> </w:t>
+      </w:r>
+      <w:r>
+        <w:rPr>
+          <w:rFonts w:hint="eastAsia" w:ascii="SimSun" w:hAnsi="SimSun" w:eastAsia="SimSun"/>
+          <w:sz w:val="30"/>
+          <w:szCs w:val="30"/>
+          <w:u w:val="single"/>
+        </w:rPr>
+        <w:t xml:space="preserve"> </w:t>
+      </w:r>
+      <w:r>
+        <w:rPr>
+          <w:rFonts w:hint="eastAsia" w:ascii="SimSun" w:hAnsi="SimSun"/>
+          <w:sz w:val="30"/>
+          <w:szCs w:val="30"/>
+          <w:u w:val="single"/>
+          <w:lang w:val="en-US" w:eastAsia="zh-CN"/>
+        </w:rPr>
+        <w:t xml:space="preserve">       </w:t>
+      </w:r>
+      <w:r>
+        <w:rPr>
+          <w:rFonts w:hint="eastAsia" w:ascii="SimSun" w:hAnsi="SimSun" w:eastAsia="SimSun"/>
+          <w:sz w:val="30"/>
+          <w:szCs w:val="30"/>
+          <w:u w:val="single"/>
+        </w:rPr>
+        <w:t>）</w:t>
+      </w:r>
+      <w:r>
+        <w:rPr>
+          <w:rFonts w:ascii="Times New Roman" w:hAnsi="Times New Roman" w:eastAsia="SimSun" w:cs="Times New Roman"/>
+          <w:sz w:val="30"/>
+          <w:szCs w:val="30"/>
+          <w:u w:val="single"/>
+        </w:rPr>
+        <w:t xml:space="preserve"> </w:t>
+      </w:r>
+      <w:r>
+        <w:rPr>
+          <w:rFonts w:ascii="SimSun" w:hAnsi="SimSun" w:eastAsia="SimSun"/>
+          <w:sz w:val="30"/>
+          <w:szCs w:val="30"/>
+        </w:rPr>
+        <w:t>根据《中华人民共和国刑事诉讼法》相关规定，特聘请北京市盈科（青岛）律师事务所律师</w:t>
+      </w:r>
+      <w:r>
+        <w:rPr>
+          <w:rFonts w:hint="eastAsia" w:ascii="SimSun" w:hAnsi="SimSun" w:eastAsia="SimSun"/>
+          <w:sz w:val="30"/>
+          <w:szCs w:val="30"/>
+          <w:u w:val="single"/>
+        </w:rPr>
+        <w:t xml:space="preserve"> </w:t>
+      </w:r>
+      <w:r>
+        <w:rPr>
+          <w:rFonts w:ascii="SimSun" w:hAnsi="SimSun" w:eastAsia="SimSun"/>
+          <w:sz w:val="30"/>
+          <w:szCs w:val="30"/>
+          <w:u w:val="single"/>
+        </w:rPr>
+        <w:t xml:space="preserve"> </w:t>
+      </w:r>
+      <w:r>
+        <w:rPr>
+          <w:rFonts w:hint="eastAsia" w:ascii="SimSun" w:hAnsi="SimSun" w:eastAsia="SimSun"/>
+          <w:sz w:val="30"/>
+          <w:szCs w:val="30"/>
+          <w:u w:val="single"/>
+        </w:rPr>
+        <w:t xml:space="preserve"> </w:t>
+      </w:r>
+      <w:r>
+        <w:rPr>
+          <w:rFonts w:ascii="SimSun" w:hAnsi="SimSun" w:eastAsia="SimSun"/>
+          <w:sz w:val="30"/>
+          <w:szCs w:val="30"/>
+          <w:u w:val="single"/>
+        </w:rPr>
+        <w:t xml:space="preserve">       </w:t>
+      </w:r>
+      <w:r>
+        <w:rPr>
+          <w:rFonts w:hint="eastAsia" w:ascii="SimSun" w:hAnsi="SimSun" w:eastAsia="SimSun"/>
+          <w:sz w:val="30"/>
+          <w:szCs w:val="30"/>
+          <w:u w:val="single"/>
+        </w:rPr>
+        <w:t xml:space="preserve">  </w:t>
+      </w:r>
+      <w:r>
+        <w:rPr>
+          <w:rFonts w:ascii="SimSun" w:hAnsi="SimSun" w:eastAsia="SimSun"/>
+          <w:sz w:val="30"/>
+          <w:szCs w:val="30"/>
+          <w:u w:val="single"/>
+        </w:rPr>
+        <w:t xml:space="preserve"> </w:t>
+      </w:r>
+      <w:r>
+        <w:rPr>
+          <w:rFonts w:ascii="SimSun" w:hAnsi="SimSun" w:eastAsia="SimSun"/>
+          <w:sz w:val="30"/>
+          <w:szCs w:val="30"/>
+        </w:rPr>
+        <w:t>为</w:t>
+      </w:r>
+      <w:r>
+        <w:rPr>
+          <w:rFonts w:hint="eastAsia" w:ascii="SimSun" w:hAnsi="SimSun" w:eastAsia="SimSun"/>
+          <w:sz w:val="30"/>
+          <w:szCs w:val="30"/>
+        </w:rPr>
+        <w:t>涉嫌</w:t>
+      </w:r>
+      <w:r>
+        <w:rPr>
+          <w:rFonts w:hint="eastAsia" w:ascii="SimSun" w:hAnsi="SimSun" w:eastAsia="SimSun"/>
+          <w:sz w:val="30"/>
+          <w:szCs w:val="30"/>
+          <w:u w:val="single"/>
+        </w:rPr>
+        <w:t xml:space="preserve"> </w:t>
+      </w:r>
+      <w:r>
+        <w:rPr>
+          <w:rFonts w:hint="default" w:ascii="SimSun" w:hAnsi="SimSun" w:eastAsia="SimSun"/>
+          <w:sz w:val="30"/>
+          <w:szCs w:val="30"/>
+          <w:u w:val="single"/>
+        </w:rPr>
+        <w:t>{{九案由}}</w:t>
+      </w:r>
+      <w:r>
+        <w:rPr>
+          <w:rFonts w:ascii="SimSun" w:hAnsi="SimSun" w:eastAsia="SimSun"/>
+          <w:sz w:val="30"/>
+          <w:szCs w:val="30"/>
+          <w:u w:val="single"/>
+        </w:rPr>
+        <w:t xml:space="preserve"> </w:t>
+      </w:r>
+      <w:r>
+        <w:rPr>
+          <w:rFonts w:ascii="SimSun" w:hAnsi="SimSun" w:eastAsia="SimSun"/>
+          <w:sz w:val="30"/>
+          <w:szCs w:val="30"/>
+        </w:rPr>
+        <w:t>案件的犯罪嫌疑人</w:t>
+      </w:r>
+      <w:r>
+        <w:rPr>
+          <w:rFonts w:hint="eastAsia" w:ascii="SimSun" w:hAnsi="SimSun" w:eastAsia="SimSun"/>
+          <w:sz w:val="30"/>
+          <w:szCs w:val="30"/>
+        </w:rPr>
+        <w:t>/</w:t>
+      </w:r>
+      <w:r>
+        <w:rPr>
+          <w:rFonts w:ascii="SimSun" w:hAnsi="SimSun" w:eastAsia="SimSun"/>
+          <w:sz w:val="30"/>
+          <w:szCs w:val="30"/>
+        </w:rPr>
+        <w:t>被告人</w:t>
+      </w:r>
+      <w:r>
+        <w:rPr>
+          <w:rFonts w:hint="eastAsia" w:ascii="SimSun" w:hAnsi="SimSun" w:eastAsia="SimSun"/>
+          <w:sz w:val="30"/>
+          <w:szCs w:val="30"/>
+          <w:u w:val="single"/>
+        </w:rPr>
+        <w:t xml:space="preserve"> </w:t>
+      </w:r>
+      <w:r>
+        <w:rPr>
+          <w:rFonts w:hint="default" w:ascii="SimSun" w:hAnsi="SimSun" w:eastAsia="SimSun"/>
+          <w:sz w:val="30"/>
+          <w:szCs w:val="30"/>
+          <w:u w:val="single"/>
+        </w:rPr>
+        <w:t>{{八犯罪嫌疑人}}</w:t>
+      </w:r>
+      <w:r>
+        <w:rPr>
+          <w:rFonts w:ascii="Times New Roman" w:hAnsi="Times New Roman" w:eastAsia="SimSun" w:cs="Times New Roman"/>
+          <w:sz w:val="30"/>
+          <w:szCs w:val="30"/>
+          <w:u w:val="single"/>
+        </w:rPr>
+        <w:t xml:space="preserve"> </w:t>
+      </w:r>
+      <w:r>
+        <w:rPr>
+          <w:rFonts w:ascii="SimSun" w:hAnsi="SimSun" w:eastAsia="SimSun"/>
+          <w:sz w:val="30"/>
+          <w:szCs w:val="30"/>
+        </w:rPr>
+        <w:t>的辩护人。</w:t>
+      </w:r>
     </w:p>
     <w:p>
       <w:pPr>
@@ -373,7 +428,7 @@
           <w:sz w:val="28"/>
           <w:szCs w:val="28"/>
         </w:rPr>
-        <w:t>{{委托日期}}</w:t>
+        <w:t>{{一委托日期}}</w:t>
       </w:r>
     </w:p>
     <w:p>
@@ -1257,7 +1312,7 @@
     <w:lsdException w:qFormat="1" w:unhideWhenUsed="0" w:uiPriority="0" w:semiHidden="0" w:name="Title"/>
     <w:lsdException w:unhideWhenUsed="0" w:uiPriority="0" w:semiHidden="0" w:name="Closing"/>
     <w:lsdException w:unhideWhenUsed="0" w:uiPriority="0" w:semiHidden="0" w:name="Signature"/>
-    <w:lsdException w:uiPriority="1" w:semiHidden="0" w:name="Default Paragraph Font"/>
+    <w:lsdException w:qFormat="1" w:uiPriority="1" w:semiHidden="0" w:name="Default Paragraph Font"/>
     <w:lsdException w:unhideWhenUsed="0" w:uiPriority="0" w:semiHidden="0" w:name="Body Text"/>
     <w:lsdException w:unhideWhenUsed="0" w:uiPriority="0" w:semiHidden="0" w:name="Body Text Indent"/>
     <w:lsdException w:unhideWhenUsed="0" w:uiPriority="0" w:semiHidden="0" w:name="List Continue"/>
@@ -1472,6 +1527,7 @@
   <w:style w:type="character" w:default="1" w:styleId="9">
     <w:name w:val="Default Paragraph Font"/>
     <w:unhideWhenUsed/>
+    <w:qFormat/>
     <w:uiPriority w:val="1"/>
   </w:style>
   <w:style w:type="table" w:default="1" w:styleId="8">

</xml_diff>